<commit_message>
feat: update Robotnik sprite, adjust enemy mechanics, and standardize blaster cooldown to 3 seconds
</commit_message>
<xml_diff>
--- a/Relatorio_Algoritmos_V2.docx
+++ b/Relatorio_Algoritmos_V2.docx
@@ -51,7 +51,7 @@
         <w:rPr>
           <w:sz w:val="23"/>
         </w:rPr>
-        <w:t>A nova versao atualiza o jogo com um inimigo capaz de perseguir automaticamente o personagem principal, um sistema de quatro vidas, tiros lentos de blaster e duas fases com dificuldade crescente. O jogador coleta a moeda da fase 1 para avancar e coleta a moeda da fase 2 para vencer.</w:t>
+        <w:t>A nova versao atualiza o jogo com um inimigo capaz de perseguir automaticamente o personagem principal, um sistema de quatro vidas, tiros lentos de blaster a cada 3 segundos e duas fases com dificuldade crescente. O jogador coleta a moeda da fase 1 para avancar e coleta a moeda da fase 2 para vencer.</w:t>
       </w:r>
     </w:p>
     <w:p>
@@ -167,7 +167,7 @@
         <w:rPr>
           <w:sz w:val="23"/>
         </w:rPr>
-        <w:t>Na fase 1 a velocidade de voo do Robotnik e 1.25 e a velocidade dos tiros e 2.4. Na fase 2 o voo aumenta para 2.0 e os tiros para 3.1, cumprindo o requisito extra de aumentar a dificuldade conforme a fase, mas com balanceamento acessivel.</w:t>
+        <w:t>Na fase 1 a velocidade de voo do Robotnik e 1.25 e a velocidade dos tiros e 2.4. Na fase 2 o voo aumenta para 2.0 e os tiros para 3.1. Em ambas as fases, Robotnik dispara um tiro a cada 3 segundos, cumprindo o requisito de ataque com balanceamento acessivel.</w:t>
       </w:r>
     </w:p>
     <w:p>
@@ -261,7 +261,7 @@
         <w:rPr>
           <w:sz w:val="23"/>
         </w:rPr>
-        <w:t>As fases sao controladas pela lista PHASES. Cada item define numero da fase, classe visual do cenario, degraus com espinhos, velocidade de voo do Robotnik, velocidade dos tiros de blaster e intervalo do ciclo dos espinhos.</w:t>
+        <w:t>As fases sao controladas pela lista PHASES. Cada item define numero da fase, classe visual do cenario, degraus com espinhos, velocidade de voo do Robotnik, velocidade dos tiros de blaster, intervalo fixo de 3 segundos entre disparos e intervalo do ciclo dos espinhos.</w:t>
       </w:r>
     </w:p>
     <w:p>

</xml_diff>

<commit_message>
feat: update Robotnik movement, add collision detection, and replace phase 2 background image
</commit_message>
<xml_diff>
--- a/Relatorio_Algoritmos_V2.docx
+++ b/Relatorio_Algoritmos_V2.docx
@@ -237,7 +237,7 @@
         <w:rPr>
           <w:sz w:val="23"/>
         </w:rPr>
-        <w:t>Ao encostar em um espinho ativo ou em um tiro lento de blaster, o jogo remove uma vida. Se ainda houver vidas, o personagem volta ao inicio da fase e recebe invulnerabilidade temporaria. Se as vidas chegarem a zero, o jogo exibe Game Over.</w:t>
+        <w:t>Ao encostar em um espinho ativo, no corpo do Robotnik ou em um tiro lento de blaster, o jogo remove uma vida. Se ainda houver vidas, o personagem volta ao inicio da fase e recebe invulnerabilidade temporaria. Se as vidas chegarem a zero, o jogo exibe Game Over.</w:t>
       </w:r>
     </w:p>
     <w:p>
@@ -261,7 +261,7 @@
         <w:rPr>
           <w:sz w:val="23"/>
         </w:rPr>
-        <w:t>As fases sao controladas pela lista PHASES. Cada item define numero da fase, classe visual do cenario, degraus com espinhos, velocidade de voo do Robotnik, velocidade dos tiros de blaster, intervalo fixo de 3 segundos entre disparos e intervalo do ciclo dos espinhos.</w:t>
+        <w:t>As fases sao controladas pela lista PHASES. Cada item define numero da fase, classe visual do cenario, incluindo background2.jpg na fase 2, degraus com espinhos, velocidade de voo do Robotnik, velocidade dos tiros de blaster, intervalo fixo de 3 segundos entre disparos e intervalo do ciclo dos espinhos.</w:t>
       </w:r>
     </w:p>
     <w:p>
@@ -296,7 +296,7 @@
         <w:rPr>
           <w:sz w:val="23"/>
         </w:rPr>
-        <w:t>Para demonstrar, abra index.html, inicie o jogo, mostre o HUD com pontos, tempo, fase e vidas, mostre Robotnik voando e disparando tiros lentos de blaster, provoque uma colisao para mostrar a perda de vida, colete a moeda da fase 1 para trocar de cenario e colete a moeda da fase 2 para vencer.</w:t>
+        <w:t>Para demonstrar, abra index.html, inicie o jogo, mostre o HUD com pontos, tempo, fase e vidas, mostre Robotnik voando mais acima do Sonic, a colisao com o corpo dele e os tiros lentos de blaster, provoque uma colisao para mostrar a perda de vida, colete a moeda da fase 1 para trocar de cenario e colete a moeda da fase 2 para vencer.</w:t>
       </w:r>
     </w:p>
     <w:p>

</xml_diff>